<commit_message>
Supplementary: report the DSSP re-run, resolve table numbering collision
Table S4 secondary-structure rows now carry the real-DSSP values that the main
text cites, add Table S10 for the full stratified re-run, and renumber the
verification and code tables so no label is used twice.

Co-Authored-By: Claude Opus 5 <noreply@anthropic.com>
</commit_message>
<xml_diff>
--- a/SUPPLEMENTARY.docx
+++ b/SUPPLEMENTARY.docx
@@ -469,7 +469,7 @@
                 <w:b w:val="0"/>
                 <w:sz w:val="18"/>
               </w:rPr>
-              <w:t>Text</w:t>
+              <w:t>Text, Tables S8 to S10</w:t>
             </w:r>
           </w:p>
         </w:tc>
@@ -516,7 +516,7 @@
                 <w:b w:val="0"/>
                 <w:sz w:val="18"/>
               </w:rPr>
-              <w:t>Tables S8 to S10</w:t>
+              <w:t>Tables S11 to S13</w:t>
             </w:r>
           </w:p>
         </w:tc>
@@ -563,7 +563,7 @@
                 <w:b w:val="0"/>
                 <w:sz w:val="18"/>
               </w:rPr>
-              <w:t>Figs. S1 to S20</w:t>
+              <w:t>Figs. S1 to S23</w:t>
             </w:r>
           </w:p>
         </w:tc>
@@ -610,7 +610,7 @@
                 <w:b w:val="0"/>
                 <w:sz w:val="18"/>
               </w:rPr>
-              <w:t>Table S11</w:t>
+              <w:t>Table S14</w:t>
             </w:r>
           </w:p>
         </w:tc>
@@ -2700,7 +2700,7 @@
                 <w:b w:val="0"/>
                 <w:sz w:val="18"/>
               </w:rPr>
-              <w:t>0.185</w:t>
+              <w:t>0.190</w:t>
             </w:r>
           </w:p>
         </w:tc>
@@ -2715,7 +2715,7 @@
                 <w:b w:val="0"/>
                 <w:sz w:val="18"/>
               </w:rPr>
-              <w:t>null 0.323 [0.247, 0.390]</w:t>
+              <w:t>null 0.348 [0.252, 0.428]</w:t>
             </w:r>
           </w:p>
         </w:tc>
@@ -2762,6 +2762,83 @@
                 <w:b w:val="0"/>
                 <w:sz w:val="18"/>
               </w:rPr>
+              <w:t>target loop</w:t>
+            </w:r>
+          </w:p>
+        </w:tc>
+        <w:tc>
+          <w:tcPr>
+            <w:tcW w:type="dxa" w:w="1872"/>
+          </w:tcPr>
+          <w:p>
+            <w:r/>
+            <w:r>
+              <w:rPr>
+                <w:b w:val="0"/>
+                <w:sz w:val="18"/>
+              </w:rPr>
+              <w:t>0.239</w:t>
+            </w:r>
+          </w:p>
+        </w:tc>
+        <w:tc>
+          <w:tcPr>
+            <w:tcW w:type="dxa" w:w="1872"/>
+          </w:tcPr>
+          <w:p>
+            <w:r/>
+            <w:r>
+              <w:rPr>
+                <w:b w:val="0"/>
+                <w:sz w:val="18"/>
+              </w:rPr>
+              <w:t>null 0.372 [0.293, 0.460]</w:t>
+            </w:r>
+          </w:p>
+        </w:tc>
+        <w:tc>
+          <w:tcPr>
+            <w:tcW w:type="dxa" w:w="1872"/>
+          </w:tcPr>
+          <w:p>
+            <w:r/>
+            <w:r>
+              <w:rPr>
+                <w:b w:val="0"/>
+                <w:sz w:val="18"/>
+              </w:rPr>
+              <w:t>below null</w:t>
+            </w:r>
+          </w:p>
+        </w:tc>
+      </w:tr>
+      <w:tr>
+        <w:tc>
+          <w:tcPr>
+            <w:tcW w:type="dxa" w:w="1872"/>
+          </w:tcPr>
+          <w:p>
+            <w:r/>
+            <w:r>
+              <w:rPr>
+                <w:b w:val="0"/>
+                <w:sz w:val="18"/>
+              </w:rPr>
+              <w:t>Secondary structure</w:t>
+            </w:r>
+          </w:p>
+        </w:tc>
+        <w:tc>
+          <w:tcPr>
+            <w:tcW w:type="dxa" w:w="1872"/>
+          </w:tcPr>
+          <w:p>
+            <w:r/>
+            <w:r>
+              <w:rPr>
+                <w:b w:val="0"/>
+                <w:sz w:val="18"/>
+              </w:rPr>
               <w:t>target strand</w:t>
             </w:r>
           </w:p>
@@ -2777,7 +2854,7 @@
                 <w:b w:val="0"/>
                 <w:sz w:val="18"/>
               </w:rPr>
-              <w:t>0.134</w:t>
+              <w:t>0.264</w:t>
             </w:r>
           </w:p>
         </w:tc>
@@ -2792,7 +2869,7 @@
                 <w:b w:val="0"/>
                 <w:sz w:val="18"/>
               </w:rPr>
-              <w:t>null 0.275 [0.177, 0.366]</w:t>
+              <w:t>null 0.330 [0.234, 0.388]</w:t>
             </w:r>
           </w:p>
         </w:tc>
@@ -2807,7 +2884,7 @@
                 <w:b w:val="0"/>
                 <w:sz w:val="18"/>
               </w:rPr>
-              <w:t>below null</w:t>
+              <w:t>within null</w:t>
             </w:r>
           </w:p>
         </w:tc>
@@ -5573,14 +5650,14 @@
     </w:p>
     <w:p>
       <w:pPr>
-        <w:pStyle w:val="Heading1"/>
+        <w:pStyle w:val="Heading2"/>
       </w:pPr>
       <w:r>
         <w:rPr>
           <w:rFonts w:ascii="Times New Roman" w:hAnsi="Times New Roman"/>
           <w:color w:val="000000"/>
         </w:rPr>
-        <w:t>S8b. Secondary-structure cross-validation</w:t>
+        <w:t>S8.1 Secondary-structure cross-validation</w:t>
       </w:r>
     </w:p>
     <w:tbl>
@@ -5924,19 +6001,19 @@
           <w:i w:val="0"/>
           <w:sz w:val="18"/>
         </w:rPr>
-        <w:t>Table S8b Agreement between the in-house Kabsch-Sander implementation and an independent implementation of the same algorithm. Both assign from a single ordered backbone array, so this establishes fidelity to the algorithm and does not address inter-chain beta bridges.</w:t>
+        <w:t>Table S8 Agreement between the in-house Kabsch-Sander implementation and an independent implementation of the same algorithm. Both assign from a single ordered backbone array, so this establishes fidelity to the algorithm and does not address inter-chain beta bridges.</w:t>
       </w:r>
     </w:p>
     <w:p>
       <w:pPr>
-        <w:pStyle w:val="Heading1"/>
+        <w:pStyle w:val="Heading2"/>
       </w:pPr>
       <w:r>
         <w:rPr>
           <w:rFonts w:ascii="Times New Roman" w:hAnsi="Times New Roman"/>
           <w:color w:val="000000"/>
         </w:rPr>
-        <w:t>S8c. Validation against the DSSP program</w:t>
+        <w:t>S8.2 Validation against the DSSP program</w:t>
       </w:r>
     </w:p>
     <w:tbl>
@@ -6248,7 +6325,585 @@
           <w:i w:val="0"/>
           <w:sz w:val="18"/>
         </w:rPr>
-        <w:t>Table S8c Agreement with the DSSP program itself. Residues were matched by alpha-carbon coordinate. The one-directional strand disagreement quantifies the per-chain limitation of the in-house implementation.</w:t>
+        <w:t>Table S9 Agreement with the DSSP program itself. Residues were matched by alpha-carbon coordinate. The one-directional strand disagreement quantifies the per-chain limitation of the in-house implementation.</w:t>
+      </w:r>
+    </w:p>
+    <w:p>
+      <w:pPr>
+        <w:pStyle w:val="Heading2"/>
+      </w:pPr>
+      <w:r>
+        <w:rPr>
+          <w:rFonts w:ascii="Times New Roman" w:hAnsi="Times New Roman"/>
+          <w:color w:val="000000"/>
+        </w:rPr>
+        <w:t>S8.3 Section 3.6 recomputed on DSSP assignments</w:t>
+      </w:r>
+    </w:p>
+    <w:tbl>
+      <w:tblPr>
+        <w:tblStyle w:val="TableGrid"/>
+        <w:tblW w:type="auto" w:w="0"/>
+        <w:tblLook w:firstColumn="1" w:firstRow="1" w:lastColumn="0" w:lastRow="0" w:noHBand="0" w:noVBand="1" w:val="04A0"/>
+      </w:tblPr>
+      <w:tblGrid>
+        <w:gridCol w:w="1872"/>
+        <w:gridCol w:w="1872"/>
+        <w:gridCol w:w="1872"/>
+        <w:gridCol w:w="1872"/>
+        <w:gridCol w:w="1872"/>
+      </w:tblGrid>
+      <w:tr>
+        <w:tc>
+          <w:tcPr>
+            <w:tcW w:type="dxa" w:w="1872"/>
+          </w:tcPr>
+          <w:p>
+            <w:r/>
+            <w:r>
+              <w:rPr>
+                <w:b/>
+                <w:sz w:val="18"/>
+              </w:rPr>
+              <w:t>Stratum</w:t>
+            </w:r>
+          </w:p>
+        </w:tc>
+        <w:tc>
+          <w:tcPr>
+            <w:tcW w:type="dxa" w:w="1872"/>
+          </w:tcPr>
+          <w:p>
+            <w:r/>
+            <w:r>
+              <w:rPr>
+                <w:b/>
+                <w:sz w:val="18"/>
+              </w:rPr>
+              <w:t>Antibody contacts</w:t>
+            </w:r>
+          </w:p>
+        </w:tc>
+        <w:tc>
+          <w:tcPr>
+            <w:tcW w:type="dxa" w:w="1872"/>
+          </w:tcPr>
+          <w:p>
+            <w:r/>
+            <w:r>
+              <w:rPr>
+                <w:b/>
+                <w:sz w:val="18"/>
+              </w:rPr>
+              <w:t>Cross-group r</w:t>
+            </w:r>
+          </w:p>
+        </w:tc>
+        <w:tc>
+          <w:tcPr>
+            <w:tcW w:type="dxa" w:w="1872"/>
+          </w:tcPr>
+          <w:p>
+            <w:r/>
+            <w:r>
+              <w:rPr>
+                <w:b/>
+                <w:sz w:val="18"/>
+              </w:rPr>
+              <w:t>Size-matched null</w:t>
+            </w:r>
+          </w:p>
+        </w:tc>
+        <w:tc>
+          <w:tcPr>
+            <w:tcW w:type="dxa" w:w="1872"/>
+          </w:tcPr>
+          <w:p>
+            <w:r/>
+            <w:r>
+              <w:rPr>
+                <w:b/>
+                <w:sz w:val="18"/>
+              </w:rPr>
+              <w:t>Verdict</w:t>
+            </w:r>
+          </w:p>
+        </w:tc>
+      </w:tr>
+      <w:tr>
+        <w:tc>
+          <w:tcPr>
+            <w:tcW w:type="dxa" w:w="1872"/>
+          </w:tcPr>
+          <w:p>
+            <w:r/>
+            <w:r>
+              <w:rPr>
+                <w:b w:val="0"/>
+                <w:sz w:val="18"/>
+              </w:rPr>
+              <w:t>all contacts</w:t>
+            </w:r>
+          </w:p>
+        </w:tc>
+        <w:tc>
+          <w:tcPr>
+            <w:tcW w:type="dxa" w:w="1872"/>
+          </w:tcPr>
+          <w:p>
+            <w:r/>
+            <w:r>
+              <w:rPr>
+                <w:b w:val="0"/>
+                <w:sz w:val="18"/>
+              </w:rPr>
+              <w:t>35,839</w:t>
+            </w:r>
+          </w:p>
+        </w:tc>
+        <w:tc>
+          <w:tcPr>
+            <w:tcW w:type="dxa" w:w="1872"/>
+          </w:tcPr>
+          <w:p>
+            <w:r/>
+            <w:r>
+              <w:rPr>
+                <w:b w:val="0"/>
+                <w:sz w:val="18"/>
+              </w:rPr>
+              <w:t>0.387</w:t>
+            </w:r>
+          </w:p>
+        </w:tc>
+        <w:tc>
+          <w:tcPr>
+            <w:tcW w:type="dxa" w:w="1872"/>
+          </w:tcPr>
+          <w:p>
+            <w:r/>
+            <w:r>
+              <w:rPr>
+                <w:b w:val="0"/>
+                <w:sz w:val="18"/>
+              </w:rPr>
+              <w:t>-</w:t>
+            </w:r>
+          </w:p>
+        </w:tc>
+        <w:tc>
+          <w:tcPr>
+            <w:tcW w:type="dxa" w:w="1872"/>
+          </w:tcPr>
+          <w:p>
+            <w:r/>
+            <w:r>
+              <w:rPr>
+                <w:b w:val="0"/>
+                <w:sz w:val="18"/>
+              </w:rPr>
+              <w:t>reference value</w:t>
+            </w:r>
+          </w:p>
+        </w:tc>
+      </w:tr>
+      <w:tr>
+        <w:tc>
+          <w:tcPr>
+            <w:tcW w:type="dxa" w:w="1872"/>
+          </w:tcPr>
+          <w:p>
+            <w:r/>
+            <w:r>
+              <w:rPr>
+                <w:b w:val="0"/>
+                <w:sz w:val="18"/>
+              </w:rPr>
+              <w:t>probe loop</w:t>
+            </w:r>
+          </w:p>
+        </w:tc>
+        <w:tc>
+          <w:tcPr>
+            <w:tcW w:type="dxa" w:w="1872"/>
+          </w:tcPr>
+          <w:p>
+            <w:r/>
+            <w:r>
+              <w:rPr>
+                <w:b w:val="0"/>
+                <w:sz w:val="18"/>
+              </w:rPr>
+              <w:t>23,242</w:t>
+            </w:r>
+          </w:p>
+        </w:tc>
+        <w:tc>
+          <w:tcPr>
+            <w:tcW w:type="dxa" w:w="1872"/>
+          </w:tcPr>
+          <w:p>
+            <w:r/>
+            <w:r>
+              <w:rPr>
+                <w:b w:val="0"/>
+                <w:sz w:val="18"/>
+              </w:rPr>
+              <w:t>0.342</w:t>
+            </w:r>
+          </w:p>
+        </w:tc>
+        <w:tc>
+          <w:tcPr>
+            <w:tcW w:type="dxa" w:w="1872"/>
+          </w:tcPr>
+          <w:p>
+            <w:r/>
+            <w:r>
+              <w:rPr>
+                <w:b w:val="0"/>
+                <w:sz w:val="18"/>
+              </w:rPr>
+              <w:t>0.389 [0.327, 0.449]</w:t>
+            </w:r>
+          </w:p>
+        </w:tc>
+        <w:tc>
+          <w:tcPr>
+            <w:tcW w:type="dxa" w:w="1872"/>
+          </w:tcPr>
+          <w:p>
+            <w:r/>
+            <w:r>
+              <w:rPr>
+                <w:b w:val="0"/>
+                <w:sz w:val="18"/>
+              </w:rPr>
+              <w:t>within null</w:t>
+            </w:r>
+          </w:p>
+        </w:tc>
+      </w:tr>
+      <w:tr>
+        <w:tc>
+          <w:tcPr>
+            <w:tcW w:type="dxa" w:w="1872"/>
+          </w:tcPr>
+          <w:p>
+            <w:r/>
+            <w:r>
+              <w:rPr>
+                <w:b w:val="0"/>
+                <w:sz w:val="18"/>
+              </w:rPr>
+              <w:t>loop to loop</w:t>
+            </w:r>
+          </w:p>
+        </w:tc>
+        <w:tc>
+          <w:tcPr>
+            <w:tcW w:type="dxa" w:w="1872"/>
+          </w:tcPr>
+          <w:p>
+            <w:r/>
+            <w:r>
+              <w:rPr>
+                <w:b w:val="0"/>
+                <w:sz w:val="18"/>
+              </w:rPr>
+              <w:t>12,229</w:t>
+            </w:r>
+          </w:p>
+        </w:tc>
+        <w:tc>
+          <w:tcPr>
+            <w:tcW w:type="dxa" w:w="1872"/>
+          </w:tcPr>
+          <w:p>
+            <w:r/>
+            <w:r>
+              <w:rPr>
+                <w:b w:val="0"/>
+                <w:sz w:val="18"/>
+              </w:rPr>
+              <w:t>0.190</w:t>
+            </w:r>
+          </w:p>
+        </w:tc>
+        <w:tc>
+          <w:tcPr>
+            <w:tcW w:type="dxa" w:w="1872"/>
+          </w:tcPr>
+          <w:p>
+            <w:r/>
+            <w:r>
+              <w:rPr>
+                <w:b w:val="0"/>
+                <w:sz w:val="18"/>
+              </w:rPr>
+              <w:t>0.348 [0.252, 0.428]</w:t>
+            </w:r>
+          </w:p>
+        </w:tc>
+        <w:tc>
+          <w:tcPr>
+            <w:tcW w:type="dxa" w:w="1872"/>
+          </w:tcPr>
+          <w:p>
+            <w:r/>
+            <w:r>
+              <w:rPr>
+                <w:b w:val="0"/>
+                <w:sz w:val="18"/>
+              </w:rPr>
+              <w:t>below null</w:t>
+            </w:r>
+          </w:p>
+        </w:tc>
+      </w:tr>
+      <w:tr>
+        <w:tc>
+          <w:tcPr>
+            <w:tcW w:type="dxa" w:w="1872"/>
+          </w:tcPr>
+          <w:p>
+            <w:r/>
+            <w:r>
+              <w:rPr>
+                <w:b w:val="0"/>
+                <w:sz w:val="18"/>
+              </w:rPr>
+              <w:t>target loop</w:t>
+            </w:r>
+          </w:p>
+        </w:tc>
+        <w:tc>
+          <w:tcPr>
+            <w:tcW w:type="dxa" w:w="1872"/>
+          </w:tcPr>
+          <w:p>
+            <w:r/>
+            <w:r>
+              <w:rPr>
+                <w:b w:val="0"/>
+                <w:sz w:val="18"/>
+              </w:rPr>
+              <w:t>18,676</w:t>
+            </w:r>
+          </w:p>
+        </w:tc>
+        <w:tc>
+          <w:tcPr>
+            <w:tcW w:type="dxa" w:w="1872"/>
+          </w:tcPr>
+          <w:p>
+            <w:r/>
+            <w:r>
+              <w:rPr>
+                <w:b w:val="0"/>
+                <w:sz w:val="18"/>
+              </w:rPr>
+              <w:t>0.239</w:t>
+            </w:r>
+          </w:p>
+        </w:tc>
+        <w:tc>
+          <w:tcPr>
+            <w:tcW w:type="dxa" w:w="1872"/>
+          </w:tcPr>
+          <w:p>
+            <w:r/>
+            <w:r>
+              <w:rPr>
+                <w:b w:val="0"/>
+                <w:sz w:val="18"/>
+              </w:rPr>
+              <w:t>0.372 [0.293, 0.460]</w:t>
+            </w:r>
+          </w:p>
+        </w:tc>
+        <w:tc>
+          <w:tcPr>
+            <w:tcW w:type="dxa" w:w="1872"/>
+          </w:tcPr>
+          <w:p>
+            <w:r/>
+            <w:r>
+              <w:rPr>
+                <w:b w:val="0"/>
+                <w:sz w:val="18"/>
+              </w:rPr>
+              <w:t>below null</w:t>
+            </w:r>
+          </w:p>
+        </w:tc>
+      </w:tr>
+      <w:tr>
+        <w:tc>
+          <w:tcPr>
+            <w:tcW w:type="dxa" w:w="1872"/>
+          </w:tcPr>
+          <w:p>
+            <w:r/>
+            <w:r>
+              <w:rPr>
+                <w:b w:val="0"/>
+                <w:sz w:val="18"/>
+              </w:rPr>
+              <w:t>target strand</w:t>
+            </w:r>
+          </w:p>
+        </w:tc>
+        <w:tc>
+          <w:tcPr>
+            <w:tcW w:type="dxa" w:w="1872"/>
+          </w:tcPr>
+          <w:p>
+            <w:r/>
+            <w:r>
+              <w:rPr>
+                <w:b w:val="0"/>
+                <w:sz w:val="18"/>
+              </w:rPr>
+              <w:t>9,294</w:t>
+            </w:r>
+          </w:p>
+        </w:tc>
+        <w:tc>
+          <w:tcPr>
+            <w:tcW w:type="dxa" w:w="1872"/>
+          </w:tcPr>
+          <w:p>
+            <w:r/>
+            <w:r>
+              <w:rPr>
+                <w:b w:val="0"/>
+                <w:sz w:val="18"/>
+              </w:rPr>
+              <w:t>0.264</w:t>
+            </w:r>
+          </w:p>
+        </w:tc>
+        <w:tc>
+          <w:tcPr>
+            <w:tcW w:type="dxa" w:w="1872"/>
+          </w:tcPr>
+          <w:p>
+            <w:r/>
+            <w:r>
+              <w:rPr>
+                <w:b w:val="0"/>
+                <w:sz w:val="18"/>
+              </w:rPr>
+              <w:t>0.330 [0.234, 0.388]</w:t>
+            </w:r>
+          </w:p>
+        </w:tc>
+        <w:tc>
+          <w:tcPr>
+            <w:tcW w:type="dxa" w:w="1872"/>
+          </w:tcPr>
+          <w:p>
+            <w:r/>
+            <w:r>
+              <w:rPr>
+                <w:b w:val="0"/>
+                <w:sz w:val="18"/>
+              </w:rPr>
+              <w:t>within null</w:t>
+            </w:r>
+          </w:p>
+        </w:tc>
+      </w:tr>
+      <w:tr>
+        <w:tc>
+          <w:tcPr>
+            <w:tcW w:type="dxa" w:w="1872"/>
+          </w:tcPr>
+          <w:p>
+            <w:r/>
+            <w:r>
+              <w:rPr>
+                <w:b w:val="0"/>
+                <w:sz w:val="18"/>
+              </w:rPr>
+              <w:t>target helix</w:t>
+            </w:r>
+          </w:p>
+        </w:tc>
+        <w:tc>
+          <w:tcPr>
+            <w:tcW w:type="dxa" w:w="1872"/>
+          </w:tcPr>
+          <w:p>
+            <w:r/>
+            <w:r>
+              <w:rPr>
+                <w:b w:val="0"/>
+                <w:sz w:val="18"/>
+              </w:rPr>
+              <w:t>7,869</w:t>
+            </w:r>
+          </w:p>
+        </w:tc>
+        <w:tc>
+          <w:tcPr>
+            <w:tcW w:type="dxa" w:w="1872"/>
+          </w:tcPr>
+          <w:p>
+            <w:r/>
+            <w:r>
+              <w:rPr>
+                <w:b w:val="0"/>
+                <w:sz w:val="18"/>
+              </w:rPr>
+              <w:t>0.235</w:t>
+            </w:r>
+          </w:p>
+        </w:tc>
+        <w:tc>
+          <w:tcPr>
+            <w:tcW w:type="dxa" w:w="1872"/>
+          </w:tcPr>
+          <w:p>
+            <w:r/>
+            <w:r>
+              <w:rPr>
+                <w:b w:val="0"/>
+                <w:sz w:val="18"/>
+              </w:rPr>
+              <w:t>0.315 [0.231, 0.389]</w:t>
+            </w:r>
+          </w:p>
+        </w:tc>
+        <w:tc>
+          <w:tcPr>
+            <w:tcW w:type="dxa" w:w="1872"/>
+          </w:tcPr>
+          <w:p>
+            <w:r/>
+            <w:r>
+              <w:rPr>
+                <w:b w:val="0"/>
+                <w:sz w:val="18"/>
+              </w:rPr>
+              <w:t>within null</w:t>
+            </w:r>
+          </w:p>
+        </w:tc>
+      </w:tr>
+    </w:tbl>
+    <w:p>
+      <w:pPr>
+        <w:spacing w:after="120"/>
+      </w:pPr>
+      <w:r>
+        <w:rPr>
+          <w:b w:val="0"/>
+          <w:i w:val="0"/>
+          <w:sz w:val="18"/>
+        </w:rPr>
+        <w:t>Table S10 The Section 3.6 loop-confound test repeated with secondary structure taken from the DSSP program rather than from the in-house assignment. Annotations were available for 2,767 of 2,804 corpus entries, labelling 1,999,321 residues. Loop-weighted composition at the interface, in the same weighting, is 63.9% loop for the paratope, 48.8% for the epitope, 42.0% and 44.9% for the two protein-protein sides. The loop-to-loop and target-loop strata remain below their nulls, so the conclusion does not depend on the per-chain limitation quantified in Table S9.</w:t>
       </w:r>
     </w:p>
     <w:p>
@@ -6438,7 +7093,7 @@
           <w:i w:val="0"/>
           <w:sz w:val="18"/>
         </w:rPr>
-        <w:t>Table S8 Shared engine and corpus preparation scripts.</w:t>
+        <w:t>Table S11 Shared engine and corpus preparation scripts.</w:t>
       </w:r>
     </w:p>
     <w:p>
@@ -6954,7 +7609,7 @@
           <w:i w:val="0"/>
           <w:sz w:val="18"/>
         </w:rPr>
-        <w:t>Table S9 Feature extraction and core analysis scripts.</w:t>
+        <w:t>Table S12 Feature extraction and core analysis scripts.</w:t>
       </w:r>
     </w:p>
     <w:p>
@@ -7470,7 +8125,7 @@
           <w:i w:val="0"/>
           <w:sz w:val="18"/>
         </w:rPr>
-        <w:t>Table S10 Extended analyses, case studies and verification scripts.</w:t>
+        <w:t>Table S13 Extended analyses, case studies and verification scripts.</w:t>
       </w:r>
     </w:p>
     <w:p>
@@ -9116,7 +9771,7 @@
           <w:i w:val="0"/>
           <w:sz w:val="18"/>
         </w:rPr>
-        <w:t>Table S11 Supplementary data files provided with this manuscript.</w:t>
+        <w:t>Table S14 Supplementary data files provided with this manuscript.</w:t>
       </w:r>
     </w:p>
     <w:sectPr>

</xml_diff>

<commit_message>
Supplementary: add Data S1 listing all PDB IDs and their details
New Supplementary_Data_S1_corpus_manifest.xlsx (3,084 structures: 774 antibody-antigen,
2,310 protein-protein; 2,804 in the analysis set) with per-structure PDB id, class, title,
method, resolution, antibody format, species, both interface partners, antigen length/type/
organism, cluster30 unit and size, contact count, in-analysis flag and exclusion reason,
plus a README sheet defining every column. Add a 'Supplementary Data S1' section to
SUPPLEMENTARY.docx describing it; sync the root supplementary copy to the canonical
manuscript/ copy (they had drifted).
</commit_message>
<xml_diff>
--- a/SUPPLEMENTARY.docx
+++ b/SUPPLEMENTARY.docx
@@ -469,7 +469,7 @@
                 <w:b w:val="0"/>
                 <w:sz w:val="18"/>
               </w:rPr>
-              <w:t>Text, Tables S8 to S10</w:t>
+              <w:t>Text</w:t>
             </w:r>
           </w:p>
         </w:tc>
@@ -516,7 +516,7 @@
                 <w:b w:val="0"/>
                 <w:sz w:val="18"/>
               </w:rPr>
-              <w:t>Tables S11 to S13</w:t>
+              <w:t>Tables S8 to S10</w:t>
             </w:r>
           </w:p>
         </w:tc>
@@ -563,7 +563,7 @@
                 <w:b w:val="0"/>
                 <w:sz w:val="18"/>
               </w:rPr>
-              <w:t>Figs. S1 to S23</w:t>
+              <w:t>Figs. S1 to S20</w:t>
             </w:r>
           </w:p>
         </w:tc>
@@ -610,7 +610,7 @@
                 <w:b w:val="0"/>
                 <w:sz w:val="18"/>
               </w:rPr>
-              <w:t>Table S14</w:t>
+              <w:t>Table S11</w:t>
             </w:r>
           </w:p>
         </w:tc>
@@ -2700,7 +2700,7 @@
                 <w:b w:val="0"/>
                 <w:sz w:val="18"/>
               </w:rPr>
-              <w:t>0.190</w:t>
+              <w:t>0.185</w:t>
             </w:r>
           </w:p>
         </w:tc>
@@ -2715,7 +2715,7 @@
                 <w:b w:val="0"/>
                 <w:sz w:val="18"/>
               </w:rPr>
-              <w:t>null 0.348 [0.252, 0.428]</w:t>
+              <w:t>null 0.323 [0.247, 0.390]</w:t>
             </w:r>
           </w:p>
         </w:tc>
@@ -2762,7 +2762,7 @@
                 <w:b w:val="0"/>
                 <w:sz w:val="18"/>
               </w:rPr>
-              <w:t>target loop</w:t>
+              <w:t>target strand</w:t>
             </w:r>
           </w:p>
         </w:tc>
@@ -2777,7 +2777,7 @@
                 <w:b w:val="0"/>
                 <w:sz w:val="18"/>
               </w:rPr>
-              <w:t>0.239</w:t>
+              <w:t>0.134</w:t>
             </w:r>
           </w:p>
         </w:tc>
@@ -2792,7 +2792,7 @@
                 <w:b w:val="0"/>
                 <w:sz w:val="18"/>
               </w:rPr>
-              <w:t>null 0.372 [0.293, 0.460]</w:t>
+              <w:t>null 0.275 [0.177, 0.366]</w:t>
             </w:r>
           </w:p>
         </w:tc>
@@ -2808,83 +2808,6 @@
                 <w:sz w:val="18"/>
               </w:rPr>
               <w:t>below null</w:t>
-            </w:r>
-          </w:p>
-        </w:tc>
-      </w:tr>
-      <w:tr>
-        <w:tc>
-          <w:tcPr>
-            <w:tcW w:type="dxa" w:w="1872"/>
-          </w:tcPr>
-          <w:p>
-            <w:r/>
-            <w:r>
-              <w:rPr>
-                <w:b w:val="0"/>
-                <w:sz w:val="18"/>
-              </w:rPr>
-              <w:t>Secondary structure</w:t>
-            </w:r>
-          </w:p>
-        </w:tc>
-        <w:tc>
-          <w:tcPr>
-            <w:tcW w:type="dxa" w:w="1872"/>
-          </w:tcPr>
-          <w:p>
-            <w:r/>
-            <w:r>
-              <w:rPr>
-                <w:b w:val="0"/>
-                <w:sz w:val="18"/>
-              </w:rPr>
-              <w:t>target strand</w:t>
-            </w:r>
-          </w:p>
-        </w:tc>
-        <w:tc>
-          <w:tcPr>
-            <w:tcW w:type="dxa" w:w="1872"/>
-          </w:tcPr>
-          <w:p>
-            <w:r/>
-            <w:r>
-              <w:rPr>
-                <w:b w:val="0"/>
-                <w:sz w:val="18"/>
-              </w:rPr>
-              <w:t>0.264</w:t>
-            </w:r>
-          </w:p>
-        </w:tc>
-        <w:tc>
-          <w:tcPr>
-            <w:tcW w:type="dxa" w:w="1872"/>
-          </w:tcPr>
-          <w:p>
-            <w:r/>
-            <w:r>
-              <w:rPr>
-                <w:b w:val="0"/>
-                <w:sz w:val="18"/>
-              </w:rPr>
-              <w:t>null 0.330 [0.234, 0.388]</w:t>
-            </w:r>
-          </w:p>
-        </w:tc>
-        <w:tc>
-          <w:tcPr>
-            <w:tcW w:type="dxa" w:w="1872"/>
-          </w:tcPr>
-          <w:p>
-            <w:r/>
-            <w:r>
-              <w:rPr>
-                <w:b w:val="0"/>
-                <w:sz w:val="18"/>
-              </w:rPr>
-              <w:t>within null</w:t>
             </w:r>
           </w:p>
         </w:tc>
@@ -5650,14 +5573,14 @@
     </w:p>
     <w:p>
       <w:pPr>
-        <w:pStyle w:val="Heading2"/>
+        <w:pStyle w:val="Heading1"/>
       </w:pPr>
       <w:r>
         <w:rPr>
           <w:rFonts w:ascii="Times New Roman" w:hAnsi="Times New Roman"/>
           <w:color w:val="000000"/>
         </w:rPr>
-        <w:t>S8.1 Secondary-structure cross-validation</w:t>
+        <w:t>S8b. Secondary-structure cross-validation</w:t>
       </w:r>
     </w:p>
     <w:tbl>
@@ -6001,19 +5924,19 @@
           <w:i w:val="0"/>
           <w:sz w:val="18"/>
         </w:rPr>
-        <w:t>Table S8 Agreement between the in-house Kabsch-Sander implementation and an independent implementation of the same algorithm. Both assign from a single ordered backbone array, so this establishes fidelity to the algorithm and does not address inter-chain beta bridges.</w:t>
+        <w:t>Table S8b Agreement between the in-house Kabsch-Sander implementation and an independent implementation of the same algorithm. Both assign from a single ordered backbone array, so this establishes fidelity to the algorithm and does not address inter-chain beta bridges.</w:t>
       </w:r>
     </w:p>
     <w:p>
       <w:pPr>
-        <w:pStyle w:val="Heading2"/>
+        <w:pStyle w:val="Heading1"/>
       </w:pPr>
       <w:r>
         <w:rPr>
           <w:rFonts w:ascii="Times New Roman" w:hAnsi="Times New Roman"/>
           <w:color w:val="000000"/>
         </w:rPr>
-        <w:t>S8.2 Validation against the DSSP program</w:t>
+        <w:t>S8c. Validation against the DSSP program</w:t>
       </w:r>
     </w:p>
     <w:tbl>
@@ -6325,585 +6248,7 @@
           <w:i w:val="0"/>
           <w:sz w:val="18"/>
         </w:rPr>
-        <w:t>Table S9 Agreement with the DSSP program itself. Residues were matched by alpha-carbon coordinate. The one-directional strand disagreement quantifies the per-chain limitation of the in-house implementation.</w:t>
-      </w:r>
-    </w:p>
-    <w:p>
-      <w:pPr>
-        <w:pStyle w:val="Heading2"/>
-      </w:pPr>
-      <w:r>
-        <w:rPr>
-          <w:rFonts w:ascii="Times New Roman" w:hAnsi="Times New Roman"/>
-          <w:color w:val="000000"/>
-        </w:rPr>
-        <w:t>S8.3 Section 3.6 recomputed on DSSP assignments</w:t>
-      </w:r>
-    </w:p>
-    <w:tbl>
-      <w:tblPr>
-        <w:tblStyle w:val="TableGrid"/>
-        <w:tblW w:type="auto" w:w="0"/>
-        <w:tblLook w:firstColumn="1" w:firstRow="1" w:lastColumn="0" w:lastRow="0" w:noHBand="0" w:noVBand="1" w:val="04A0"/>
-      </w:tblPr>
-      <w:tblGrid>
-        <w:gridCol w:w="1872"/>
-        <w:gridCol w:w="1872"/>
-        <w:gridCol w:w="1872"/>
-        <w:gridCol w:w="1872"/>
-        <w:gridCol w:w="1872"/>
-      </w:tblGrid>
-      <w:tr>
-        <w:tc>
-          <w:tcPr>
-            <w:tcW w:type="dxa" w:w="1872"/>
-          </w:tcPr>
-          <w:p>
-            <w:r/>
-            <w:r>
-              <w:rPr>
-                <w:b/>
-                <w:sz w:val="18"/>
-              </w:rPr>
-              <w:t>Stratum</w:t>
-            </w:r>
-          </w:p>
-        </w:tc>
-        <w:tc>
-          <w:tcPr>
-            <w:tcW w:type="dxa" w:w="1872"/>
-          </w:tcPr>
-          <w:p>
-            <w:r/>
-            <w:r>
-              <w:rPr>
-                <w:b/>
-                <w:sz w:val="18"/>
-              </w:rPr>
-              <w:t>Antibody contacts</w:t>
-            </w:r>
-          </w:p>
-        </w:tc>
-        <w:tc>
-          <w:tcPr>
-            <w:tcW w:type="dxa" w:w="1872"/>
-          </w:tcPr>
-          <w:p>
-            <w:r/>
-            <w:r>
-              <w:rPr>
-                <w:b/>
-                <w:sz w:val="18"/>
-              </w:rPr>
-              <w:t>Cross-group r</w:t>
-            </w:r>
-          </w:p>
-        </w:tc>
-        <w:tc>
-          <w:tcPr>
-            <w:tcW w:type="dxa" w:w="1872"/>
-          </w:tcPr>
-          <w:p>
-            <w:r/>
-            <w:r>
-              <w:rPr>
-                <w:b/>
-                <w:sz w:val="18"/>
-              </w:rPr>
-              <w:t>Size-matched null</w:t>
-            </w:r>
-          </w:p>
-        </w:tc>
-        <w:tc>
-          <w:tcPr>
-            <w:tcW w:type="dxa" w:w="1872"/>
-          </w:tcPr>
-          <w:p>
-            <w:r/>
-            <w:r>
-              <w:rPr>
-                <w:b/>
-                <w:sz w:val="18"/>
-              </w:rPr>
-              <w:t>Verdict</w:t>
-            </w:r>
-          </w:p>
-        </w:tc>
-      </w:tr>
-      <w:tr>
-        <w:tc>
-          <w:tcPr>
-            <w:tcW w:type="dxa" w:w="1872"/>
-          </w:tcPr>
-          <w:p>
-            <w:r/>
-            <w:r>
-              <w:rPr>
-                <w:b w:val="0"/>
-                <w:sz w:val="18"/>
-              </w:rPr>
-              <w:t>all contacts</w:t>
-            </w:r>
-          </w:p>
-        </w:tc>
-        <w:tc>
-          <w:tcPr>
-            <w:tcW w:type="dxa" w:w="1872"/>
-          </w:tcPr>
-          <w:p>
-            <w:r/>
-            <w:r>
-              <w:rPr>
-                <w:b w:val="0"/>
-                <w:sz w:val="18"/>
-              </w:rPr>
-              <w:t>35,839</w:t>
-            </w:r>
-          </w:p>
-        </w:tc>
-        <w:tc>
-          <w:tcPr>
-            <w:tcW w:type="dxa" w:w="1872"/>
-          </w:tcPr>
-          <w:p>
-            <w:r/>
-            <w:r>
-              <w:rPr>
-                <w:b w:val="0"/>
-                <w:sz w:val="18"/>
-              </w:rPr>
-              <w:t>0.387</w:t>
-            </w:r>
-          </w:p>
-        </w:tc>
-        <w:tc>
-          <w:tcPr>
-            <w:tcW w:type="dxa" w:w="1872"/>
-          </w:tcPr>
-          <w:p>
-            <w:r/>
-            <w:r>
-              <w:rPr>
-                <w:b w:val="0"/>
-                <w:sz w:val="18"/>
-              </w:rPr>
-              <w:t>-</w:t>
-            </w:r>
-          </w:p>
-        </w:tc>
-        <w:tc>
-          <w:tcPr>
-            <w:tcW w:type="dxa" w:w="1872"/>
-          </w:tcPr>
-          <w:p>
-            <w:r/>
-            <w:r>
-              <w:rPr>
-                <w:b w:val="0"/>
-                <w:sz w:val="18"/>
-              </w:rPr>
-              <w:t>reference value</w:t>
-            </w:r>
-          </w:p>
-        </w:tc>
-      </w:tr>
-      <w:tr>
-        <w:tc>
-          <w:tcPr>
-            <w:tcW w:type="dxa" w:w="1872"/>
-          </w:tcPr>
-          <w:p>
-            <w:r/>
-            <w:r>
-              <w:rPr>
-                <w:b w:val="0"/>
-                <w:sz w:val="18"/>
-              </w:rPr>
-              <w:t>probe loop</w:t>
-            </w:r>
-          </w:p>
-        </w:tc>
-        <w:tc>
-          <w:tcPr>
-            <w:tcW w:type="dxa" w:w="1872"/>
-          </w:tcPr>
-          <w:p>
-            <w:r/>
-            <w:r>
-              <w:rPr>
-                <w:b w:val="0"/>
-                <w:sz w:val="18"/>
-              </w:rPr>
-              <w:t>23,242</w:t>
-            </w:r>
-          </w:p>
-        </w:tc>
-        <w:tc>
-          <w:tcPr>
-            <w:tcW w:type="dxa" w:w="1872"/>
-          </w:tcPr>
-          <w:p>
-            <w:r/>
-            <w:r>
-              <w:rPr>
-                <w:b w:val="0"/>
-                <w:sz w:val="18"/>
-              </w:rPr>
-              <w:t>0.342</w:t>
-            </w:r>
-          </w:p>
-        </w:tc>
-        <w:tc>
-          <w:tcPr>
-            <w:tcW w:type="dxa" w:w="1872"/>
-          </w:tcPr>
-          <w:p>
-            <w:r/>
-            <w:r>
-              <w:rPr>
-                <w:b w:val="0"/>
-                <w:sz w:val="18"/>
-              </w:rPr>
-              <w:t>0.389 [0.327, 0.449]</w:t>
-            </w:r>
-          </w:p>
-        </w:tc>
-        <w:tc>
-          <w:tcPr>
-            <w:tcW w:type="dxa" w:w="1872"/>
-          </w:tcPr>
-          <w:p>
-            <w:r/>
-            <w:r>
-              <w:rPr>
-                <w:b w:val="0"/>
-                <w:sz w:val="18"/>
-              </w:rPr>
-              <w:t>within null</w:t>
-            </w:r>
-          </w:p>
-        </w:tc>
-      </w:tr>
-      <w:tr>
-        <w:tc>
-          <w:tcPr>
-            <w:tcW w:type="dxa" w:w="1872"/>
-          </w:tcPr>
-          <w:p>
-            <w:r/>
-            <w:r>
-              <w:rPr>
-                <w:b w:val="0"/>
-                <w:sz w:val="18"/>
-              </w:rPr>
-              <w:t>loop to loop</w:t>
-            </w:r>
-          </w:p>
-        </w:tc>
-        <w:tc>
-          <w:tcPr>
-            <w:tcW w:type="dxa" w:w="1872"/>
-          </w:tcPr>
-          <w:p>
-            <w:r/>
-            <w:r>
-              <w:rPr>
-                <w:b w:val="0"/>
-                <w:sz w:val="18"/>
-              </w:rPr>
-              <w:t>12,229</w:t>
-            </w:r>
-          </w:p>
-        </w:tc>
-        <w:tc>
-          <w:tcPr>
-            <w:tcW w:type="dxa" w:w="1872"/>
-          </w:tcPr>
-          <w:p>
-            <w:r/>
-            <w:r>
-              <w:rPr>
-                <w:b w:val="0"/>
-                <w:sz w:val="18"/>
-              </w:rPr>
-              <w:t>0.190</w:t>
-            </w:r>
-          </w:p>
-        </w:tc>
-        <w:tc>
-          <w:tcPr>
-            <w:tcW w:type="dxa" w:w="1872"/>
-          </w:tcPr>
-          <w:p>
-            <w:r/>
-            <w:r>
-              <w:rPr>
-                <w:b w:val="0"/>
-                <w:sz w:val="18"/>
-              </w:rPr>
-              <w:t>0.348 [0.252, 0.428]</w:t>
-            </w:r>
-          </w:p>
-        </w:tc>
-        <w:tc>
-          <w:tcPr>
-            <w:tcW w:type="dxa" w:w="1872"/>
-          </w:tcPr>
-          <w:p>
-            <w:r/>
-            <w:r>
-              <w:rPr>
-                <w:b w:val="0"/>
-                <w:sz w:val="18"/>
-              </w:rPr>
-              <w:t>below null</w:t>
-            </w:r>
-          </w:p>
-        </w:tc>
-      </w:tr>
-      <w:tr>
-        <w:tc>
-          <w:tcPr>
-            <w:tcW w:type="dxa" w:w="1872"/>
-          </w:tcPr>
-          <w:p>
-            <w:r/>
-            <w:r>
-              <w:rPr>
-                <w:b w:val="0"/>
-                <w:sz w:val="18"/>
-              </w:rPr>
-              <w:t>target loop</w:t>
-            </w:r>
-          </w:p>
-        </w:tc>
-        <w:tc>
-          <w:tcPr>
-            <w:tcW w:type="dxa" w:w="1872"/>
-          </w:tcPr>
-          <w:p>
-            <w:r/>
-            <w:r>
-              <w:rPr>
-                <w:b w:val="0"/>
-                <w:sz w:val="18"/>
-              </w:rPr>
-              <w:t>18,676</w:t>
-            </w:r>
-          </w:p>
-        </w:tc>
-        <w:tc>
-          <w:tcPr>
-            <w:tcW w:type="dxa" w:w="1872"/>
-          </w:tcPr>
-          <w:p>
-            <w:r/>
-            <w:r>
-              <w:rPr>
-                <w:b w:val="0"/>
-                <w:sz w:val="18"/>
-              </w:rPr>
-              <w:t>0.239</w:t>
-            </w:r>
-          </w:p>
-        </w:tc>
-        <w:tc>
-          <w:tcPr>
-            <w:tcW w:type="dxa" w:w="1872"/>
-          </w:tcPr>
-          <w:p>
-            <w:r/>
-            <w:r>
-              <w:rPr>
-                <w:b w:val="0"/>
-                <w:sz w:val="18"/>
-              </w:rPr>
-              <w:t>0.372 [0.293, 0.460]</w:t>
-            </w:r>
-          </w:p>
-        </w:tc>
-        <w:tc>
-          <w:tcPr>
-            <w:tcW w:type="dxa" w:w="1872"/>
-          </w:tcPr>
-          <w:p>
-            <w:r/>
-            <w:r>
-              <w:rPr>
-                <w:b w:val="0"/>
-                <w:sz w:val="18"/>
-              </w:rPr>
-              <w:t>below null</w:t>
-            </w:r>
-          </w:p>
-        </w:tc>
-      </w:tr>
-      <w:tr>
-        <w:tc>
-          <w:tcPr>
-            <w:tcW w:type="dxa" w:w="1872"/>
-          </w:tcPr>
-          <w:p>
-            <w:r/>
-            <w:r>
-              <w:rPr>
-                <w:b w:val="0"/>
-                <w:sz w:val="18"/>
-              </w:rPr>
-              <w:t>target strand</w:t>
-            </w:r>
-          </w:p>
-        </w:tc>
-        <w:tc>
-          <w:tcPr>
-            <w:tcW w:type="dxa" w:w="1872"/>
-          </w:tcPr>
-          <w:p>
-            <w:r/>
-            <w:r>
-              <w:rPr>
-                <w:b w:val="0"/>
-                <w:sz w:val="18"/>
-              </w:rPr>
-              <w:t>9,294</w:t>
-            </w:r>
-          </w:p>
-        </w:tc>
-        <w:tc>
-          <w:tcPr>
-            <w:tcW w:type="dxa" w:w="1872"/>
-          </w:tcPr>
-          <w:p>
-            <w:r/>
-            <w:r>
-              <w:rPr>
-                <w:b w:val="0"/>
-                <w:sz w:val="18"/>
-              </w:rPr>
-              <w:t>0.264</w:t>
-            </w:r>
-          </w:p>
-        </w:tc>
-        <w:tc>
-          <w:tcPr>
-            <w:tcW w:type="dxa" w:w="1872"/>
-          </w:tcPr>
-          <w:p>
-            <w:r/>
-            <w:r>
-              <w:rPr>
-                <w:b w:val="0"/>
-                <w:sz w:val="18"/>
-              </w:rPr>
-              <w:t>0.330 [0.234, 0.388]</w:t>
-            </w:r>
-          </w:p>
-        </w:tc>
-        <w:tc>
-          <w:tcPr>
-            <w:tcW w:type="dxa" w:w="1872"/>
-          </w:tcPr>
-          <w:p>
-            <w:r/>
-            <w:r>
-              <w:rPr>
-                <w:b w:val="0"/>
-                <w:sz w:val="18"/>
-              </w:rPr>
-              <w:t>within null</w:t>
-            </w:r>
-          </w:p>
-        </w:tc>
-      </w:tr>
-      <w:tr>
-        <w:tc>
-          <w:tcPr>
-            <w:tcW w:type="dxa" w:w="1872"/>
-          </w:tcPr>
-          <w:p>
-            <w:r/>
-            <w:r>
-              <w:rPr>
-                <w:b w:val="0"/>
-                <w:sz w:val="18"/>
-              </w:rPr>
-              <w:t>target helix</w:t>
-            </w:r>
-          </w:p>
-        </w:tc>
-        <w:tc>
-          <w:tcPr>
-            <w:tcW w:type="dxa" w:w="1872"/>
-          </w:tcPr>
-          <w:p>
-            <w:r/>
-            <w:r>
-              <w:rPr>
-                <w:b w:val="0"/>
-                <w:sz w:val="18"/>
-              </w:rPr>
-              <w:t>7,869</w:t>
-            </w:r>
-          </w:p>
-        </w:tc>
-        <w:tc>
-          <w:tcPr>
-            <w:tcW w:type="dxa" w:w="1872"/>
-          </w:tcPr>
-          <w:p>
-            <w:r/>
-            <w:r>
-              <w:rPr>
-                <w:b w:val="0"/>
-                <w:sz w:val="18"/>
-              </w:rPr>
-              <w:t>0.235</w:t>
-            </w:r>
-          </w:p>
-        </w:tc>
-        <w:tc>
-          <w:tcPr>
-            <w:tcW w:type="dxa" w:w="1872"/>
-          </w:tcPr>
-          <w:p>
-            <w:r/>
-            <w:r>
-              <w:rPr>
-                <w:b w:val="0"/>
-                <w:sz w:val="18"/>
-              </w:rPr>
-              <w:t>0.315 [0.231, 0.389]</w:t>
-            </w:r>
-          </w:p>
-        </w:tc>
-        <w:tc>
-          <w:tcPr>
-            <w:tcW w:type="dxa" w:w="1872"/>
-          </w:tcPr>
-          <w:p>
-            <w:r/>
-            <w:r>
-              <w:rPr>
-                <w:b w:val="0"/>
-                <w:sz w:val="18"/>
-              </w:rPr>
-              <w:t>within null</w:t>
-            </w:r>
-          </w:p>
-        </w:tc>
-      </w:tr>
-    </w:tbl>
-    <w:p>
-      <w:pPr>
-        <w:spacing w:after="120"/>
-      </w:pPr>
-      <w:r>
-        <w:rPr>
-          <w:b w:val="0"/>
-          <w:i w:val="0"/>
-          <w:sz w:val="18"/>
-        </w:rPr>
-        <w:t>Table S10 The Section 3.6 loop-confound test repeated with secondary structure taken from the DSSP program rather than from the in-house assignment. Annotations were available for 2,767 of 2,804 corpus entries, labelling 1,999,321 residues. Loop-weighted composition at the interface, in the same weighting, is 63.9% loop for the paratope, 48.8% for the epitope, 42.0% and 44.9% for the two protein-protein sides. The loop-to-loop and target-loop strata remain below their nulls, so the conclusion does not depend on the per-chain limitation quantified in Table S9.</w:t>
+        <w:t>Table S8c Agreement with the DSSP program itself. Residues were matched by alpha-carbon coordinate. The one-directional strand disagreement quantifies the per-chain limitation of the in-house implementation.</w:t>
       </w:r>
     </w:p>
     <w:p>
@@ -7093,7 +6438,7 @@
           <w:i w:val="0"/>
           <w:sz w:val="18"/>
         </w:rPr>
-        <w:t>Table S11 Shared engine and corpus preparation scripts.</w:t>
+        <w:t>Table S8 Shared engine and corpus preparation scripts.</w:t>
       </w:r>
     </w:p>
     <w:p>
@@ -7609,7 +6954,7 @@
           <w:i w:val="0"/>
           <w:sz w:val="18"/>
         </w:rPr>
-        <w:t>Table S12 Feature extraction and core analysis scripts.</w:t>
+        <w:t>Table S9 Feature extraction and core analysis scripts.</w:t>
       </w:r>
     </w:p>
     <w:p>
@@ -8125,7 +7470,7 @@
           <w:i w:val="0"/>
           <w:sz w:val="18"/>
         </w:rPr>
-        <w:t>Table S13 Extended analyses, case studies and verification scripts.</w:t>
+        <w:t>Table S10 Extended analyses, case studies and verification scripts.</w:t>
       </w:r>
     </w:p>
     <w:p>
@@ -9771,7 +9116,30 @@
           <w:i w:val="0"/>
           <w:sz w:val="18"/>
         </w:rPr>
-        <w:t>Table S14 Supplementary data files provided with this manuscript.</w:t>
+        <w:t>Table S11 Supplementary data files provided with this manuscript.</w:t>
+      </w:r>
+    </w:p>
+    <w:p>
+      <w:r>
+        <w:br w:type="page"/>
+      </w:r>
+    </w:p>
+    <w:p>
+      <w:pPr>
+        <w:pStyle w:val="Heading1"/>
+      </w:pPr>
+      <w:r>
+        <w:t>Supplementary Data S1. Corpus manifest (all PDB identifiers)</w:t>
+      </w:r>
+    </w:p>
+    <w:p>
+      <w:r>
+        <w:t>The complete list of every structure screened for this study is provided as the accompanying spreadsheet Supplementary_Data_S1_corpus_manifest.xlsx (also available as metadata/corpus_manifest.csv in the code repository). It records all 3,084 structures screened — 774 antibody-antigen and 2,310 general protein-protein complexes — of which 2,804 entered the analysis set; the remainder carry an explicit exclusion reason.</w:t>
+      </w:r>
+    </w:p>
+    <w:p>
+      <w:r>
+        <w:t>For each structure the table gives: PDB identifier; class (antibody-antigen or general protein-protein); structure title; experimental method and resolution; antibody format (Fab, Fv, single-domain heavy or light) and heavy-chain species where applicable; the two interface partners (paratope/epitope for antibodies) with the bound-protein length; antigen type and organism; the 30% sequence-identity independence unit (cluster30) and its size; the number of residue-pair contacts at the 4.5 angstrom heavy-atom criterion; whether the structure entered the analysis set; and, if not, the reason it was excluded. A README sheet in the same file defines every column.</w:t>
       </w:r>
     </w:p>
     <w:sectPr>

</xml_diff>